<commit_message>
docs: correct rental evidence and redesign report cover
</commit_message>
<xml_diff>
--- a/reports/Bergamo_Report_Contents_EN.docx
+++ b/reports/Bergamo_Report_Contents_EN.docx
@@ -12,12 +12,12 @@
     </w:p>
     <w:p>
       <w:r>
-        <w:t>Rental Strategies in Bergamo: More Tourists, More Profit?</w:t>
+        <w:t>More Tourists, More Profit?</w:t>
       </w:r>
     </w:p>
     <w:p>
       <w:r>
-        <w:t>Page numbers refer to the complete v03 report.</w:t>
+        <w:t>Page numbers refer to the main report; the cover is unnumbered.</w:t>
       </w:r>
     </w:p>
     <w:p>
@@ -27,7 +27,7 @@
         </w:tabs>
       </w:pPr>
       <w:r>
-        <w:t>Executive finding</w:t>
+        <w:t>Main business finding</w:t>
         <w:tab/>
         <w:t>1</w:t>
       </w:r>
@@ -207,7 +207,7 @@
         </w:tabs>
       </w:pPr>
       <w:r>
-        <w:t>Expanded rental listing screening</w:t>
+        <w:t>Rental listing methodology and verification</w:t>
         <w:tab/>
         <w:t>10</w:t>
       </w:r>
@@ -378,6 +378,18 @@
         <w:t>References</w:t>
         <w:tab/>
         <w:t>18</w:t>
+      </w:r>
+    </w:p>
+    <w:p>
+      <w:pPr>
+        <w:tabs>
+          <w:tab w:pos="8064" w:val="left"/>
+        </w:tabs>
+      </w:pPr>
+      <w:r>
+        <w:t>Appendix A Rental registry audit</w:t>
+        <w:tab/>
+        <w:t>21</w:t>
       </w:r>
     </w:p>
     <w:sectPr>

</xml_diff>

<commit_message>
Audit Bergamo rental listings and rebuild verified STR-LTR comparison
</commit_message>
<xml_diff>
--- a/reports/Bergamo_Report_Contents_EN.docx
+++ b/reports/Bergamo_Report_Contents_EN.docx
@@ -195,7 +195,7 @@
         </w:tabs>
       </w:pPr>
       <w:r>
-        <w:t>Long-term cash assumptions</w:t>
+        <w:t>Study scope and comparable-property criteria</w:t>
         <w:tab/>
         <w:t>9</w:t>
       </w:r>
@@ -207,9 +207,93 @@
         </w:tabs>
       </w:pPr>
       <w:r>
-        <w:t>Rental listing methodology and verification</w:t>
+        <w:t>Candidate reconciliation and property identity</w:t>
         <w:tab/>
         <w:t>10</w:t>
+      </w:r>
+    </w:p>
+    <w:p>
+      <w:pPr>
+        <w:tabs>
+          <w:tab w:pos="8064" w:val="left"/>
+        </w:tabs>
+      </w:pPr>
+      <w:r>
+        <w:t>Price normalisation and research corrections</w:t>
+        <w:tab/>
+        <w:t>11</w:t>
+      </w:r>
+    </w:p>
+    <w:p>
+      <w:pPr>
+        <w:tabs>
+          <w:tab w:pos="8064" w:val="left"/>
+        </w:tabs>
+      </w:pPr>
+      <w:r>
+        <w:t>Primary and secondary rental statistics</w:t>
+        <w:tab/>
+        <w:t>11</w:t>
+      </w:r>
+    </w:p>
+    <w:p>
+      <w:pPr>
+        <w:tabs>
+          <w:tab w:pos="8064" w:val="left"/>
+        </w:tabs>
+      </w:pPr>
+      <w:r>
+        <w:t>Rental distribution and comparable offers</w:t>
+        <w:tab/>
+        <w:t>12</w:t>
+      </w:r>
+    </w:p>
+    <w:p>
+      <w:pPr>
+        <w:tabs>
+          <w:tab w:pos="8064" w:val="left"/>
+        </w:tabs>
+      </w:pPr>
+      <w:r>
+        <w:t>Independent benchmarks and measurement differences</w:t>
+        <w:tab/>
+        <w:t>13</w:t>
+      </w:r>
+    </w:p>
+    <w:p>
+      <w:pPr>
+        <w:tabs>
+          <w:tab w:pos="8064" w:val="left"/>
+        </w:tabs>
+      </w:pPr>
+      <w:r>
+        <w:t>Historical and evidence-informed financial scenarios</w:t>
+        <w:tab/>
+        <w:t>14</w:t>
+      </w:r>
+    </w:p>
+    <w:p>
+      <w:pPr>
+        <w:tabs>
+          <w:tab w:pos="8064" w:val="left"/>
+        </w:tabs>
+      </w:pPr>
+      <w:r>
+        <w:t>Updated sensitivity and break-even thresholds</w:t>
+        <w:tab/>
+        <w:t>15</w:t>
+      </w:r>
+    </w:p>
+    <w:p>
+      <w:pPr>
+        <w:tabs>
+          <w:tab w:pos="8064" w:val="left"/>
+        </w:tabs>
+      </w:pPr>
+      <w:r>
+        <w:t>Conversion thresholds under the new rent</w:t>
+        <w:tab/>
+        <w:t>16</w:t>
       </w:r>
     </w:p>
     <w:p>
@@ -224,7 +308,7 @@
         </w:rPr>
         <w:t>5 Revenue, Costs and Net Cash Income</w:t>
         <w:tab/>
-        <w:t>11</w:t>
+        <w:t>17</w:t>
       </w:r>
     </w:p>
     <w:p>
@@ -236,7 +320,7 @@
       <w:r>
         <w:t>Fixed-cost budget and uncertainty</w:t>
         <w:tab/>
-        <w:t>12</w:t>
+        <w:t>18</w:t>
       </w:r>
     </w:p>
     <w:p>
@@ -248,7 +332,7 @@
       <w:r>
         <w:t>Regulatory feasibility</w:t>
         <w:tab/>
-        <w:t>13</w:t>
+        <w:t>19</w:t>
       </w:r>
     </w:p>
     <w:p>
@@ -263,7 +347,7 @@
         </w:rPr>
         <w:t>6 Sensitivity and preparation costs</w:t>
         <w:tab/>
-        <w:t>13</w:t>
+        <w:t>19</w:t>
       </w:r>
     </w:p>
     <w:p>
@@ -275,7 +359,7 @@
       <w:r>
         <w:t>Break-even and calculation checks</w:t>
         <w:tab/>
-        <w:t>13</w:t>
+        <w:t>19</w:t>
       </w:r>
     </w:p>
     <w:p>
@@ -287,7 +371,7 @@
       <w:r>
         <w:t>Long-term rent and differential-cost sensitivity</w:t>
         <w:tab/>
-        <w:t>14</w:t>
+        <w:t>20</w:t>
       </w:r>
     </w:p>
     <w:p>
@@ -299,7 +383,7 @@
       <w:r>
         <w:t>Additional preparation changes the threshold</w:t>
         <w:tab/>
-        <w:t>15</w:t>
+        <w:t>21</w:t>
       </w:r>
     </w:p>
     <w:p>
@@ -314,7 +398,7 @@
         </w:rPr>
         <w:t>7 Research methodology and challenges</w:t>
         <w:tab/>
-        <w:t>16</w:t>
+        <w:t>22</w:t>
       </w:r>
     </w:p>
     <w:p>
@@ -326,7 +410,7 @@
       <w:r>
         <w:t>Reproducibility and review</w:t>
         <w:tab/>
-        <w:t>16</w:t>
+        <w:t>22</w:t>
       </w:r>
     </w:p>
     <w:p>
@@ -341,7 +425,7 @@
         </w:rPr>
         <w:t>8 Conclusions and limitations</w:t>
         <w:tab/>
-        <w:t>17</w:t>
+        <w:t>23</w:t>
       </w:r>
     </w:p>
     <w:p>
@@ -353,7 +437,7 @@
       <w:r>
         <w:t>Supported findings</w:t>
         <w:tab/>
-        <w:t>17</w:t>
+        <w:t>23</w:t>
       </w:r>
     </w:p>
     <w:p>
@@ -365,7 +449,7 @@
       <w:r>
         <w:t>Unresolved evidence</w:t>
         <w:tab/>
-        <w:t>17</w:t>
+        <w:t>23</w:t>
       </w:r>
     </w:p>
     <w:p>
@@ -377,7 +461,7 @@
       <w:r>
         <w:t>References</w:t>
         <w:tab/>
-        <w:t>18</w:t>
+        <w:t>24</w:t>
       </w:r>
     </w:p>
     <w:p>
@@ -389,7 +473,67 @@
       <w:r>
         <w:t>Appendix A Rental registry audit</w:t>
         <w:tab/>
-        <w:t>21</w:t>
+        <w:t>27</w:t>
+      </w:r>
+    </w:p>
+    <w:p>
+      <w:pPr>
+        <w:tabs>
+          <w:tab w:pos="8064" w:val="left"/>
+        </w:tabs>
+      </w:pPr>
+      <w:r>
+        <w:t>Appendix B Complete rental candidate reconciliation</w:t>
+        <w:tab/>
+        <w:t>28</w:t>
+      </w:r>
+    </w:p>
+    <w:p>
+      <w:pPr>
+        <w:tabs>
+          <w:tab w:pos="8064" w:val="left"/>
+        </w:tabs>
+      </w:pPr>
+      <w:r>
+        <w:t>Original C records</w:t>
+        <w:tab/>
+        <w:t>28</w:t>
+      </w:r>
+    </w:p>
+    <w:p>
+      <w:pPr>
+        <w:tabs>
+          <w:tab w:pos="8064" w:val="left"/>
+        </w:tabs>
+      </w:pPr>
+      <w:r>
+        <w:t>Preliminary A leads</w:t>
+        <w:tab/>
+        <w:t>29</w:t>
+      </w:r>
+    </w:p>
+    <w:p>
+      <w:pPr>
+        <w:tabs>
+          <w:tab w:pos="8064" w:val="left"/>
+        </w:tabs>
+      </w:pPr>
+      <w:r>
+        <w:t>Additional N advertisements</w:t>
+        <w:tab/>
+        <w:t>29</w:t>
+      </w:r>
+    </w:p>
+    <w:p>
+      <w:pPr>
+        <w:tabs>
+          <w:tab w:pos="8064" w:val="left"/>
+        </w:tabs>
+      </w:pPr>
+      <w:r>
+        <w:t>Rental evidence references</w:t>
+        <w:tab/>
+        <w:t>32</w:t>
       </w:r>
     </w:p>
     <w:sectPr>
@@ -782,7 +926,7 @@
     <w:qFormat/>
     <w:rsid w:val="00FC693F"/>
     <w:pPr>
-      <w:spacing w:after="80"/>
+      <w:spacing w:after="0" w:line="240" w:lineRule="auto"/>
     </w:pPr>
     <w:rPr>
       <w:rFonts w:ascii="Calibri" w:hAnsi="Calibri"/>

</xml_diff>